<commit_message>
Unanet Senior CSM (AEC): score 83; Accelo A/E firm customers confirmed, Procore removed from profile
Co-Authored-By: Claude Opus 5.5 <noreply@anthropic.com>
Claude-Session: https://claude.ai/code/session_018DEej5NGjq1omj9BTtvEiy
</commit_message>
<xml_diff>
--- a/applications/unanet-senior-csm-aec/Unanet-SeniorCSM-AEC-CoverLetter.docx
+++ b/applications/unanet-senior-csm-aec/Unanet-SeniorCSM-AEC-CoverLetter.docx
@@ -94,7 +94,7 @@
           <w:b w:val="0"/>
           <w:color w:val="1A1A1A"/>
         </w:rPr>
-        <w:t>I know the category Unanet sells into from the vendor side. At Accelo I sold and scoped a CRM, project-management, and billing platform to professional-services firms, built the implementation plans our delivery team ran with, and worked directly with the executives deciding how their firms would run projects and bill for them. The questions your AEC customers ask about utilization, project visibility, and getting paid on time are the questions I spent two years answering.</w:t>
+        <w:t>I know the category Unanet sells into from the vendor side. At Accelo I sold and scoped a CRM, project-management, and billing platform to professional-services firms, including architecture and engineering firms, built the implementation plans our delivery team ran with, and worked directly with the executives deciding how their firms would run projects and bill for them. The questions your AEC customers ask about utilization, project visibility, and getting paid on time are the questions I spent two years answering.</w:t>
       </w:r>
     </w:p>
     <w:p>
@@ -120,7 +120,7 @@
           <w:b w:val="0"/>
           <w:color w:val="1A1A1A"/>
         </w:rPr>
-        <w:t>To be direct: I haven't supported architecture or engineering firms as a dedicated book, and I'd be learning Unanet's AEC customers specifically. The way project-based firms think about their business is not new to me. I'd welcome a conversation at 303-726-5037 or jrotnbrg@gmail.com.</w:t>
+        <w:t>I haven't carried a dedicated AEC book, and I'd be learning Unanet's product and customers specifically. The way architecture, engineering, and trade firms think about projects, people, and billing is not new to me. I'd welcome a conversation at 303-726-5037 or jrotnbrg@gmail.com.</w:t>
       </w:r>
     </w:p>
     <w:p>

</xml_diff>